<commit_message>
this is my super bad documentation have fun
</commit_message>
<xml_diff>
--- a/Documentation/FolderStructure.docx
+++ b/Documentation/FolderStructure.docx
@@ -13,17 +13,24 @@
       </w:r>
     </w:p>
     <w:p>
-      <w:r>
-        <w:t>SpookyRunner\Assets</w:t>
+      <w:proofErr w:type="spellStart"/>
+      <w:r>
+        <w:t>SpookyRunner</w:t>
+      </w:r>
+      <w:proofErr w:type="spellEnd"/>
+      <w:r>
+        <w:t>\Assets</w:t>
       </w:r>
     </w:p>
     <w:p>
       <w:pPr>
         <w:pStyle w:val="Heading2"/>
       </w:pPr>
+      <w:proofErr w:type="spellStart"/>
       <w:r>
         <w:t>AddressableAssetsData</w:t>
       </w:r>
+      <w:proofErr w:type="spellEnd"/>
     </w:p>
     <w:p>
       <w:pPr>
@@ -34,7 +41,15 @@
         </w:numPr>
       </w:pPr>
       <w:r>
-        <w:t>Relevant files for Unity Addressables package (responsible for patching)</w:t>
+        <w:t xml:space="preserve">Relevant files for Unity </w:t>
+      </w:r>
+      <w:proofErr w:type="spellStart"/>
+      <w:r>
+        <w:t>Addressables</w:t>
+      </w:r>
+      <w:proofErr w:type="spellEnd"/>
+      <w:r>
+        <w:t xml:space="preserve"> package (responsible for patching)</w:t>
       </w:r>
     </w:p>
     <w:p>
@@ -81,8 +96,13 @@
           <w:numId w:val="1"/>
         </w:numPr>
       </w:pPr>
-      <w:r>
-        <w:t>ScriptableObject data, mainly level chunk data</w:t>
+      <w:proofErr w:type="spellStart"/>
+      <w:r>
+        <w:t>ScriptableObject</w:t>
+      </w:r>
+      <w:proofErr w:type="spellEnd"/>
+      <w:r>
+        <w:t xml:space="preserve"> data, mainly level chunk data</w:t>
       </w:r>
     </w:p>
     <w:p>
@@ -121,8 +141,21 @@
           <w:numId w:val="1"/>
         </w:numPr>
       </w:pPr>
-      <w:r>
-        <w:t>Unity’s built in input system, find DefaultInput mapping here</w:t>
+      <w:proofErr w:type="gramStart"/>
+      <w:r>
+        <w:t>Unity’s</w:t>
+      </w:r>
+      <w:proofErr w:type="gramEnd"/>
+      <w:r>
+        <w:t xml:space="preserve"> built in input system, find </w:t>
+      </w:r>
+      <w:proofErr w:type="spellStart"/>
+      <w:r>
+        <w:t>DefaultInput</w:t>
+      </w:r>
+      <w:proofErr w:type="spellEnd"/>
+      <w:r>
+        <w:t xml:space="preserve"> mapping here</w:t>
       </w:r>
     </w:p>
     <w:p>
@@ -133,8 +166,21 @@
           <w:numId w:val="1"/>
         </w:numPr>
       </w:pPr>
-      <w:r>
-        <w:t>PlayerControls.cs was generated by DefaultInput (don’t remember how)</w:t>
+      <w:proofErr w:type="spellStart"/>
+      <w:r>
+        <w:t>PlayerControls.cs</w:t>
+      </w:r>
+      <w:proofErr w:type="spellEnd"/>
+      <w:r>
+        <w:t xml:space="preserve"> was generated by </w:t>
+      </w:r>
+      <w:proofErr w:type="spellStart"/>
+      <w:r>
+        <w:t>DefaultInput</w:t>
+      </w:r>
+      <w:proofErr w:type="spellEnd"/>
+      <w:r>
+        <w:t xml:space="preserve"> (don’t remember how)</w:t>
       </w:r>
     </w:p>
     <w:p>
@@ -146,8 +192,13 @@
         </w:numPr>
       </w:pPr>
       <w:r>
-        <w:t>Holds InputBuffer</w:t>
-      </w:r>
+        <w:t xml:space="preserve">Holds </w:t>
+      </w:r>
+      <w:proofErr w:type="spellStart"/>
+      <w:r>
+        <w:t>InputBuffer</w:t>
+      </w:r>
+      <w:proofErr w:type="spellEnd"/>
     </w:p>
     <w:p>
       <w:pPr>
@@ -185,17 +236,29 @@
           <w:numId w:val="1"/>
         </w:numPr>
       </w:pPr>
-      <w:r>
-        <w:t>Tileset, contains an about folder within</w:t>
+      <w:proofErr w:type="spellStart"/>
+      <w:proofErr w:type="gramStart"/>
+      <w:r>
+        <w:t>Tileset</w:t>
+      </w:r>
+      <w:proofErr w:type="spellEnd"/>
+      <w:r>
+        <w:t>,</w:t>
+      </w:r>
+      <w:proofErr w:type="gramEnd"/>
+      <w:r>
+        <w:t xml:space="preserve"> contains an about folder within</w:t>
       </w:r>
     </w:p>
     <w:p>
       <w:pPr>
         <w:pStyle w:val="Heading2"/>
       </w:pPr>
+      <w:proofErr w:type="spellStart"/>
       <w:r>
         <w:t>PlayerCharacterAssets</w:t>
       </w:r>
+      <w:proofErr w:type="spellEnd"/>
     </w:p>
     <w:p>
       <w:pPr>
@@ -218,7 +281,23 @@
         </w:numPr>
       </w:pPr>
       <w:r>
-        <w:t>In /3.Prefab, there is a CreditsMan prefab that is used in the credits (and menu)</w:t>
+        <w:t>In /</w:t>
+      </w:r>
+      <w:proofErr w:type="gramStart"/>
+      <w:r>
+        <w:t>3.Prefab</w:t>
+      </w:r>
+      <w:proofErr w:type="gramEnd"/>
+      <w:r>
+        <w:t xml:space="preserve">, there is a </w:t>
+      </w:r>
+      <w:proofErr w:type="spellStart"/>
+      <w:r>
+        <w:t>CreditsMan</w:t>
+      </w:r>
+      <w:proofErr w:type="spellEnd"/>
+      <w:r>
+        <w:t xml:space="preserve"> prefab that is used in the credits (and menu)</w:t>
       </w:r>
     </w:p>
     <w:p>
@@ -237,8 +316,13 @@
           <w:numId w:val="1"/>
         </w:numPr>
       </w:pPr>
-      <w:r>
-        <w:t>Self explanatory, all prefabs to be reused in levels</w:t>
+      <w:proofErr w:type="spellStart"/>
+      <w:r>
+        <w:t>Self explanatory</w:t>
+      </w:r>
+      <w:proofErr w:type="spellEnd"/>
+      <w:r>
+        <w:t>, all prefabs to be reused in levels</w:t>
       </w:r>
     </w:p>
     <w:p>
@@ -299,6 +383,12 @@
       </w:r>
     </w:p>
     <w:sectPr>
+      <w:headerReference w:type="even" r:id="rId8"/>
+      <w:headerReference w:type="default" r:id="rId9"/>
+      <w:footerReference w:type="even" r:id="rId10"/>
+      <w:footerReference w:type="default" r:id="rId11"/>
+      <w:headerReference w:type="first" r:id="rId12"/>
+      <w:footerReference w:type="first" r:id="rId13"/>
       <w:pgSz w:w="12240" w:h="15840"/>
       <w:pgMar w:top="1440" w:right="1440" w:bottom="1440" w:left="1440" w:header="720" w:footer="720" w:gutter="0"/>
       <w:cols w:space="720"/>
@@ -306,6 +396,132 @@
     </w:sectPr>
   </w:body>
 </w:document>
+</file>
+
+<file path=word/endnotes.xml><?xml version="1.0" encoding="utf-8"?>
+<w:endnotes xmlns:wpc="http://schemas.microsoft.com/office/word/2010/wordprocessingCanvas" xmlns:cx="http://schemas.microsoft.com/office/drawing/2014/chartex" xmlns:cx1="http://schemas.microsoft.com/office/drawing/2015/9/8/chartex" xmlns:cx2="http://schemas.microsoft.com/office/drawing/2015/10/21/chartex" xmlns:cx3="http://schemas.microsoft.com/office/drawing/2016/5/9/chartex" xmlns:cx4="http://schemas.microsoft.com/office/drawing/2016/5/10/chartex" xmlns:cx5="http://schemas.microsoft.com/office/drawing/2016/5/11/chartex" xmlns:cx6="http://schemas.microsoft.com/office/drawing/2016/5/12/chartex" xmlns:cx7="http://schemas.microsoft.com/office/drawing/2016/5/13/chartex" xmlns:cx8="http://schemas.microsoft.com/office/drawing/2016/5/14/chartex" xmlns:mc="http://schemas.openxmlformats.org/markup-compatibility/2006" xmlns:aink="http://schemas.microsoft.com/office/drawing/2016/ink" xmlns:am3d="http://schemas.microsoft.com/office/drawing/2017/model3d" xmlns:o="urn:schemas-microsoft-com:office:office" xmlns:oel="http://schemas.microsoft.com/office/2019/extlst" xmlns:r="http://schemas.openxmlformats.org/officeDocument/2006/relationships" xmlns:m="http://schemas.openxmlformats.org/officeDocument/2006/math" xmlns:v="urn:schemas-microsoft-com:vml" xmlns:wp14="http://schemas.microsoft.com/office/word/2010/wordprocessingDrawing" xmlns:wp="http://schemas.openxmlformats.org/drawingml/2006/wordprocessingDrawing" xmlns:w10="urn:schemas-microsoft-com:office:word" xmlns:w="http://schemas.openxmlformats.org/wordprocessingml/2006/main" xmlns:w14="http://schemas.microsoft.com/office/word/2010/wordml" xmlns:w15="http://schemas.microsoft.com/office/word/2012/wordml" xmlns:w16cex="http://schemas.microsoft.com/office/word/2018/wordml/cex" xmlns:w16cid="http://schemas.microsoft.com/office/word/2016/wordml/cid" xmlns:w16="http://schemas.microsoft.com/office/word/2018/wordml" xmlns:w16du="http://schemas.microsoft.com/office/word/2023/wordml/word16du" xmlns:w16sdtdh="http://schemas.microsoft.com/office/word/2020/wordml/sdtdatahash" xmlns:w16sdtfl="http://schemas.microsoft.com/office/word/2024/wordml/sdtformatlock" xmlns:w16se="http://schemas.microsoft.com/office/word/2015/wordml/symex" xmlns:wpg="http://schemas.microsoft.com/office/word/2010/wordprocessingGroup" xmlns:wpi="http://schemas.microsoft.com/office/word/2010/wordprocessingInk" xmlns:wne="http://schemas.microsoft.com/office/word/2006/wordml" xmlns:wps="http://schemas.microsoft.com/office/word/2010/wordprocessingShape" mc:Ignorable="w14 w15 w16se w16cid w16 w16cex w16sdtdh w16sdtfl w16du wp14">
+  <w:endnote w:type="separator" w:id="-1">
+    <w:p>
+      <w:pPr>
+        <w:spacing w:after="0" w:line="240" w:lineRule="auto"/>
+      </w:pPr>
+      <w:r>
+        <w:separator/>
+      </w:r>
+    </w:p>
+  </w:endnote>
+  <w:endnote w:type="continuationSeparator" w:id="0">
+    <w:p>
+      <w:pPr>
+        <w:spacing w:after="0" w:line="240" w:lineRule="auto"/>
+      </w:pPr>
+      <w:r>
+        <w:continuationSeparator/>
+      </w:r>
+    </w:p>
+  </w:endnote>
+</w:endnotes>
+</file>
+
+<file path=word/footer1.xml><?xml version="1.0" encoding="utf-8"?>
+<w:ftr xmlns:wpc="http://schemas.microsoft.com/office/word/2010/wordprocessingCanvas" xmlns:cx="http://schemas.microsoft.com/office/drawing/2014/chartex" xmlns:cx1="http://schemas.microsoft.com/office/drawing/2015/9/8/chartex" xmlns:cx2="http://schemas.microsoft.com/office/drawing/2015/10/21/chartex" xmlns:cx3="http://schemas.microsoft.com/office/drawing/2016/5/9/chartex" xmlns:cx4="http://schemas.microsoft.com/office/drawing/2016/5/10/chartex" xmlns:cx5="http://schemas.microsoft.com/office/drawing/2016/5/11/chartex" xmlns:cx6="http://schemas.microsoft.com/office/drawing/2016/5/12/chartex" xmlns:cx7="http://schemas.microsoft.com/office/drawing/2016/5/13/chartex" xmlns:cx8="http://schemas.microsoft.com/office/drawing/2016/5/14/chartex" xmlns:mc="http://schemas.openxmlformats.org/markup-compatibility/2006" xmlns:aink="http://schemas.microsoft.com/office/drawing/2016/ink" xmlns:am3d="http://schemas.microsoft.com/office/drawing/2017/model3d" xmlns:o="urn:schemas-microsoft-com:office:office" xmlns:oel="http://schemas.microsoft.com/office/2019/extlst" xmlns:r="http://schemas.openxmlformats.org/officeDocument/2006/relationships" xmlns:m="http://schemas.openxmlformats.org/officeDocument/2006/math" xmlns:v="urn:schemas-microsoft-com:vml" xmlns:wp14="http://schemas.microsoft.com/office/word/2010/wordprocessingDrawing" xmlns:wp="http://schemas.openxmlformats.org/drawingml/2006/wordprocessingDrawing" xmlns:w10="urn:schemas-microsoft-com:office:word" xmlns:w="http://schemas.openxmlformats.org/wordprocessingml/2006/main" xmlns:w14="http://schemas.microsoft.com/office/word/2010/wordml" xmlns:w15="http://schemas.microsoft.com/office/word/2012/wordml" xmlns:w16cex="http://schemas.microsoft.com/office/word/2018/wordml/cex" xmlns:w16cid="http://schemas.microsoft.com/office/word/2016/wordml/cid" xmlns:w16="http://schemas.microsoft.com/office/word/2018/wordml" xmlns:w16du="http://schemas.microsoft.com/office/word/2023/wordml/word16du" xmlns:w16sdtdh="http://schemas.microsoft.com/office/word/2020/wordml/sdtdatahash" xmlns:w16sdtfl="http://schemas.microsoft.com/office/word/2024/wordml/sdtformatlock" xmlns:w16se="http://schemas.microsoft.com/office/word/2015/wordml/symex" xmlns:wpg="http://schemas.microsoft.com/office/word/2010/wordprocessingGroup" xmlns:wpi="http://schemas.microsoft.com/office/word/2010/wordprocessingInk" xmlns:wne="http://schemas.microsoft.com/office/word/2006/wordml" xmlns:wps="http://schemas.microsoft.com/office/word/2010/wordprocessingShape" mc:Ignorable="w14 w15 w16se w16cid w16 w16cex w16sdtdh w16sdtfl w16du wp14">
+  <w:p>
+    <w:pPr>
+      <w:pStyle w:val="Footer"/>
+    </w:pPr>
+  </w:p>
+</w:ftr>
+</file>
+
+<file path=word/footer2.xml><?xml version="1.0" encoding="utf-8"?>
+<w:ftr xmlns:wpc="http://schemas.microsoft.com/office/word/2010/wordprocessingCanvas" xmlns:cx="http://schemas.microsoft.com/office/drawing/2014/chartex" xmlns:cx1="http://schemas.microsoft.com/office/drawing/2015/9/8/chartex" xmlns:cx2="http://schemas.microsoft.com/office/drawing/2015/10/21/chartex" xmlns:cx3="http://schemas.microsoft.com/office/drawing/2016/5/9/chartex" xmlns:cx4="http://schemas.microsoft.com/office/drawing/2016/5/10/chartex" xmlns:cx5="http://schemas.microsoft.com/office/drawing/2016/5/11/chartex" xmlns:cx6="http://schemas.microsoft.com/office/drawing/2016/5/12/chartex" xmlns:cx7="http://schemas.microsoft.com/office/drawing/2016/5/13/chartex" xmlns:cx8="http://schemas.microsoft.com/office/drawing/2016/5/14/chartex" xmlns:mc="http://schemas.openxmlformats.org/markup-compatibility/2006" xmlns:aink="http://schemas.microsoft.com/office/drawing/2016/ink" xmlns:am3d="http://schemas.microsoft.com/office/drawing/2017/model3d" xmlns:o="urn:schemas-microsoft-com:office:office" xmlns:oel="http://schemas.microsoft.com/office/2019/extlst" xmlns:r="http://schemas.openxmlformats.org/officeDocument/2006/relationships" xmlns:m="http://schemas.openxmlformats.org/officeDocument/2006/math" xmlns:v="urn:schemas-microsoft-com:vml" xmlns:wp14="http://schemas.microsoft.com/office/word/2010/wordprocessingDrawing" xmlns:wp="http://schemas.openxmlformats.org/drawingml/2006/wordprocessingDrawing" xmlns:w10="urn:schemas-microsoft-com:office:word" xmlns:w="http://schemas.openxmlformats.org/wordprocessingml/2006/main" xmlns:w14="http://schemas.microsoft.com/office/word/2010/wordml" xmlns:w15="http://schemas.microsoft.com/office/word/2012/wordml" xmlns:w16cex="http://schemas.microsoft.com/office/word/2018/wordml/cex" xmlns:w16cid="http://schemas.microsoft.com/office/word/2016/wordml/cid" xmlns:w16="http://schemas.microsoft.com/office/word/2018/wordml" xmlns:w16du="http://schemas.microsoft.com/office/word/2023/wordml/word16du" xmlns:w16sdtdh="http://schemas.microsoft.com/office/word/2020/wordml/sdtdatahash" xmlns:w16sdtfl="http://schemas.microsoft.com/office/word/2024/wordml/sdtformatlock" xmlns:w16se="http://schemas.microsoft.com/office/word/2015/wordml/symex" xmlns:wpg="http://schemas.microsoft.com/office/word/2010/wordprocessingGroup" xmlns:wpi="http://schemas.microsoft.com/office/word/2010/wordprocessingInk" xmlns:wne="http://schemas.microsoft.com/office/word/2006/wordml" xmlns:wps="http://schemas.microsoft.com/office/word/2010/wordprocessingShape" mc:Ignorable="w14 w15 w16se w16cid w16 w16cex w16sdtdh w16sdtfl w16du wp14">
+  <w:p>
+    <w:pPr>
+      <w:pStyle w:val="Footer"/>
+    </w:pPr>
+  </w:p>
+</w:ftr>
+</file>
+
+<file path=word/footer3.xml><?xml version="1.0" encoding="utf-8"?>
+<w:ftr xmlns:wpc="http://schemas.microsoft.com/office/word/2010/wordprocessingCanvas" xmlns:cx="http://schemas.microsoft.com/office/drawing/2014/chartex" xmlns:cx1="http://schemas.microsoft.com/office/drawing/2015/9/8/chartex" xmlns:cx2="http://schemas.microsoft.com/office/drawing/2015/10/21/chartex" xmlns:cx3="http://schemas.microsoft.com/office/drawing/2016/5/9/chartex" xmlns:cx4="http://schemas.microsoft.com/office/drawing/2016/5/10/chartex" xmlns:cx5="http://schemas.microsoft.com/office/drawing/2016/5/11/chartex" xmlns:cx6="http://schemas.microsoft.com/office/drawing/2016/5/12/chartex" xmlns:cx7="http://schemas.microsoft.com/office/drawing/2016/5/13/chartex" xmlns:cx8="http://schemas.microsoft.com/office/drawing/2016/5/14/chartex" xmlns:mc="http://schemas.openxmlformats.org/markup-compatibility/2006" xmlns:aink="http://schemas.microsoft.com/office/drawing/2016/ink" xmlns:am3d="http://schemas.microsoft.com/office/drawing/2017/model3d" xmlns:o="urn:schemas-microsoft-com:office:office" xmlns:oel="http://schemas.microsoft.com/office/2019/extlst" xmlns:r="http://schemas.openxmlformats.org/officeDocument/2006/relationships" xmlns:m="http://schemas.openxmlformats.org/officeDocument/2006/math" xmlns:v="urn:schemas-microsoft-com:vml" xmlns:wp14="http://schemas.microsoft.com/office/word/2010/wordprocessingDrawing" xmlns:wp="http://schemas.openxmlformats.org/drawingml/2006/wordprocessingDrawing" xmlns:w10="urn:schemas-microsoft-com:office:word" xmlns:w="http://schemas.openxmlformats.org/wordprocessingml/2006/main" xmlns:w14="http://schemas.microsoft.com/office/word/2010/wordml" xmlns:w15="http://schemas.microsoft.com/office/word/2012/wordml" xmlns:w16cex="http://schemas.microsoft.com/office/word/2018/wordml/cex" xmlns:w16cid="http://schemas.microsoft.com/office/word/2016/wordml/cid" xmlns:w16="http://schemas.microsoft.com/office/word/2018/wordml" xmlns:w16du="http://schemas.microsoft.com/office/word/2023/wordml/word16du" xmlns:w16sdtdh="http://schemas.microsoft.com/office/word/2020/wordml/sdtdatahash" xmlns:w16sdtfl="http://schemas.microsoft.com/office/word/2024/wordml/sdtformatlock" xmlns:w16se="http://schemas.microsoft.com/office/word/2015/wordml/symex" xmlns:wpg="http://schemas.microsoft.com/office/word/2010/wordprocessingGroup" xmlns:wpi="http://schemas.microsoft.com/office/word/2010/wordprocessingInk" xmlns:wne="http://schemas.microsoft.com/office/word/2006/wordml" xmlns:wps="http://schemas.microsoft.com/office/word/2010/wordprocessingShape" mc:Ignorable="w14 w15 w16se w16cid w16 w16cex w16sdtdh w16sdtfl w16du wp14">
+  <w:p>
+    <w:pPr>
+      <w:pStyle w:val="Footer"/>
+    </w:pPr>
+  </w:p>
+</w:ftr>
+</file>
+
+<file path=word/footnotes.xml><?xml version="1.0" encoding="utf-8"?>
+<w:footnotes xmlns:wpc="http://schemas.microsoft.com/office/word/2010/wordprocessingCanvas" xmlns:cx="http://schemas.microsoft.com/office/drawing/2014/chartex" xmlns:cx1="http://schemas.microsoft.com/office/drawing/2015/9/8/chartex" xmlns:cx2="http://schemas.microsoft.com/office/drawing/2015/10/21/chartex" xmlns:cx3="http://schemas.microsoft.com/office/drawing/2016/5/9/chartex" xmlns:cx4="http://schemas.microsoft.com/office/drawing/2016/5/10/chartex" xmlns:cx5="http://schemas.microsoft.com/office/drawing/2016/5/11/chartex" xmlns:cx6="http://schemas.microsoft.com/office/drawing/2016/5/12/chartex" xmlns:cx7="http://schemas.microsoft.com/office/drawing/2016/5/13/chartex" xmlns:cx8="http://schemas.microsoft.com/office/drawing/2016/5/14/chartex" xmlns:mc="http://schemas.openxmlformats.org/markup-compatibility/2006" xmlns:aink="http://schemas.microsoft.com/office/drawing/2016/ink" xmlns:am3d="http://schemas.microsoft.com/office/drawing/2017/model3d" xmlns:o="urn:schemas-microsoft-com:office:office" xmlns:oel="http://schemas.microsoft.com/office/2019/extlst" xmlns:r="http://schemas.openxmlformats.org/officeDocument/2006/relationships" xmlns:m="http://schemas.openxmlformats.org/officeDocument/2006/math" xmlns:v="urn:schemas-microsoft-com:vml" xmlns:wp14="http://schemas.microsoft.com/office/word/2010/wordprocessingDrawing" xmlns:wp="http://schemas.openxmlformats.org/drawingml/2006/wordprocessingDrawing" xmlns:w10="urn:schemas-microsoft-com:office:word" xmlns:w="http://schemas.openxmlformats.org/wordprocessingml/2006/main" xmlns:w14="http://schemas.microsoft.com/office/word/2010/wordml" xmlns:w15="http://schemas.microsoft.com/office/word/2012/wordml" xmlns:w16cex="http://schemas.microsoft.com/office/word/2018/wordml/cex" xmlns:w16cid="http://schemas.microsoft.com/office/word/2016/wordml/cid" xmlns:w16="http://schemas.microsoft.com/office/word/2018/wordml" xmlns:w16du="http://schemas.microsoft.com/office/word/2023/wordml/word16du" xmlns:w16sdtdh="http://schemas.microsoft.com/office/word/2020/wordml/sdtdatahash" xmlns:w16sdtfl="http://schemas.microsoft.com/office/word/2024/wordml/sdtformatlock" xmlns:w16se="http://schemas.microsoft.com/office/word/2015/wordml/symex" xmlns:wpg="http://schemas.microsoft.com/office/word/2010/wordprocessingGroup" xmlns:wpi="http://schemas.microsoft.com/office/word/2010/wordprocessingInk" xmlns:wne="http://schemas.microsoft.com/office/word/2006/wordml" xmlns:wps="http://schemas.microsoft.com/office/word/2010/wordprocessingShape" mc:Ignorable="w14 w15 w16se w16cid w16 w16cex w16sdtdh w16sdtfl w16du wp14">
+  <w:footnote w:type="separator" w:id="-1">
+    <w:p>
+      <w:pPr>
+        <w:spacing w:after="0" w:line="240" w:lineRule="auto"/>
+      </w:pPr>
+      <w:r>
+        <w:separator/>
+      </w:r>
+    </w:p>
+  </w:footnote>
+  <w:footnote w:type="continuationSeparator" w:id="0">
+    <w:p>
+      <w:pPr>
+        <w:spacing w:after="0" w:line="240" w:lineRule="auto"/>
+      </w:pPr>
+      <w:r>
+        <w:continuationSeparator/>
+      </w:r>
+    </w:p>
+  </w:footnote>
+</w:footnotes>
+</file>
+
+<file path=word/header1.xml><?xml version="1.0" encoding="utf-8"?>
+<w:hdr xmlns:wpc="http://schemas.microsoft.com/office/word/2010/wordprocessingCanvas" xmlns:cx="http://schemas.microsoft.com/office/drawing/2014/chartex" xmlns:cx1="http://schemas.microsoft.com/office/drawing/2015/9/8/chartex" xmlns:cx2="http://schemas.microsoft.com/office/drawing/2015/10/21/chartex" xmlns:cx3="http://schemas.microsoft.com/office/drawing/2016/5/9/chartex" xmlns:cx4="http://schemas.microsoft.com/office/drawing/2016/5/10/chartex" xmlns:cx5="http://schemas.microsoft.com/office/drawing/2016/5/11/chartex" xmlns:cx6="http://schemas.microsoft.com/office/drawing/2016/5/12/chartex" xmlns:cx7="http://schemas.microsoft.com/office/drawing/2016/5/13/chartex" xmlns:cx8="http://schemas.microsoft.com/office/drawing/2016/5/14/chartex" xmlns:mc="http://schemas.openxmlformats.org/markup-compatibility/2006" xmlns:aink="http://schemas.microsoft.com/office/drawing/2016/ink" xmlns:am3d="http://schemas.microsoft.com/office/drawing/2017/model3d" xmlns:o="urn:schemas-microsoft-com:office:office" xmlns:oel="http://schemas.microsoft.com/office/2019/extlst" xmlns:r="http://schemas.openxmlformats.org/officeDocument/2006/relationships" xmlns:m="http://schemas.openxmlformats.org/officeDocument/2006/math" xmlns:v="urn:schemas-microsoft-com:vml" xmlns:wp14="http://schemas.microsoft.com/office/word/2010/wordprocessingDrawing" xmlns:wp="http://schemas.openxmlformats.org/drawingml/2006/wordprocessingDrawing" xmlns:w10="urn:schemas-microsoft-com:office:word" xmlns:w="http://schemas.openxmlformats.org/wordprocessingml/2006/main" xmlns:w14="http://schemas.microsoft.com/office/word/2010/wordml" xmlns:w15="http://schemas.microsoft.com/office/word/2012/wordml" xmlns:w16cex="http://schemas.microsoft.com/office/word/2018/wordml/cex" xmlns:w16cid="http://schemas.microsoft.com/office/word/2016/wordml/cid" xmlns:w16="http://schemas.microsoft.com/office/word/2018/wordml" xmlns:w16du="http://schemas.microsoft.com/office/word/2023/wordml/word16du" xmlns:w16sdtdh="http://schemas.microsoft.com/office/word/2020/wordml/sdtdatahash" xmlns:w16sdtfl="http://schemas.microsoft.com/office/word/2024/wordml/sdtformatlock" xmlns:w16se="http://schemas.microsoft.com/office/word/2015/wordml/symex" xmlns:wpg="http://schemas.microsoft.com/office/word/2010/wordprocessingGroup" xmlns:wpi="http://schemas.microsoft.com/office/word/2010/wordprocessingInk" xmlns:wne="http://schemas.microsoft.com/office/word/2006/wordml" xmlns:wps="http://schemas.microsoft.com/office/word/2010/wordprocessingShape" mc:Ignorable="w14 w15 w16se w16cid w16 w16cex w16sdtdh w16sdtfl w16du wp14">
+  <w:p>
+    <w:pPr>
+      <w:pStyle w:val="Header"/>
+    </w:pPr>
+  </w:p>
+</w:hdr>
+</file>
+
+<file path=word/header2.xml><?xml version="1.0" encoding="utf-8"?>
+<w:hdr xmlns:wpc="http://schemas.microsoft.com/office/word/2010/wordprocessingCanvas" xmlns:cx="http://schemas.microsoft.com/office/drawing/2014/chartex" xmlns:cx1="http://schemas.microsoft.com/office/drawing/2015/9/8/chartex" xmlns:cx2="http://schemas.microsoft.com/office/drawing/2015/10/21/chartex" xmlns:cx3="http://schemas.microsoft.com/office/drawing/2016/5/9/chartex" xmlns:cx4="http://schemas.microsoft.com/office/drawing/2016/5/10/chartex" xmlns:cx5="http://schemas.microsoft.com/office/drawing/2016/5/11/chartex" xmlns:cx6="http://schemas.microsoft.com/office/drawing/2016/5/12/chartex" xmlns:cx7="http://schemas.microsoft.com/office/drawing/2016/5/13/chartex" xmlns:cx8="http://schemas.microsoft.com/office/drawing/2016/5/14/chartex" xmlns:mc="http://schemas.openxmlformats.org/markup-compatibility/2006" xmlns:aink="http://schemas.microsoft.com/office/drawing/2016/ink" xmlns:am3d="http://schemas.microsoft.com/office/drawing/2017/model3d" xmlns:o="urn:schemas-microsoft-com:office:office" xmlns:oel="http://schemas.microsoft.com/office/2019/extlst" xmlns:r="http://schemas.openxmlformats.org/officeDocument/2006/relationships" xmlns:m="http://schemas.openxmlformats.org/officeDocument/2006/math" xmlns:v="urn:schemas-microsoft-com:vml" xmlns:wp14="http://schemas.microsoft.com/office/word/2010/wordprocessingDrawing" xmlns:wp="http://schemas.openxmlformats.org/drawingml/2006/wordprocessingDrawing" xmlns:w10="urn:schemas-microsoft-com:office:word" xmlns:w="http://schemas.openxmlformats.org/wordprocessingml/2006/main" xmlns:w14="http://schemas.microsoft.com/office/word/2010/wordml" xmlns:w15="http://schemas.microsoft.com/office/word/2012/wordml" xmlns:w16cex="http://schemas.microsoft.com/office/word/2018/wordml/cex" xmlns:w16cid="http://schemas.microsoft.com/office/word/2016/wordml/cid" xmlns:w16="http://schemas.microsoft.com/office/word/2018/wordml" xmlns:w16du="http://schemas.microsoft.com/office/word/2023/wordml/word16du" xmlns:w16sdtdh="http://schemas.microsoft.com/office/word/2020/wordml/sdtdatahash" xmlns:w16sdtfl="http://schemas.microsoft.com/office/word/2024/wordml/sdtformatlock" xmlns:w16se="http://schemas.microsoft.com/office/word/2015/wordml/symex" xmlns:wpg="http://schemas.microsoft.com/office/word/2010/wordprocessingGroup" xmlns:wpi="http://schemas.microsoft.com/office/word/2010/wordprocessingInk" xmlns:wne="http://schemas.microsoft.com/office/word/2006/wordml" xmlns:wps="http://schemas.microsoft.com/office/word/2010/wordprocessingShape" mc:Ignorable="w14 w15 w16se w16cid w16 w16cex w16sdtdh w16sdtfl w16du wp14">
+  <w:p>
+    <w:pPr>
+      <w:pStyle w:val="Header"/>
+    </w:pPr>
+    <w:r>
+      <w:t>Ryder Claus – Co Tech Lead</w:t>
+    </w:r>
+  </w:p>
+  <w:p>
+    <w:pPr>
+      <w:pStyle w:val="Header"/>
+    </w:pPr>
+    <w:r>
+      <w:t>2/26/2026</w:t>
+    </w:r>
+  </w:p>
+  <w:p>
+    <w:pPr>
+      <w:pStyle w:val="Header"/>
+    </w:pPr>
+  </w:p>
+</w:hdr>
+</file>
+
+<file path=word/header3.xml><?xml version="1.0" encoding="utf-8"?>
+<w:hdr xmlns:wpc="http://schemas.microsoft.com/office/word/2010/wordprocessingCanvas" xmlns:cx="http://schemas.microsoft.com/office/drawing/2014/chartex" xmlns:cx1="http://schemas.microsoft.com/office/drawing/2015/9/8/chartex" xmlns:cx2="http://schemas.microsoft.com/office/drawing/2015/10/21/chartex" xmlns:cx3="http://schemas.microsoft.com/office/drawing/2016/5/9/chartex" xmlns:cx4="http://schemas.microsoft.com/office/drawing/2016/5/10/chartex" xmlns:cx5="http://schemas.microsoft.com/office/drawing/2016/5/11/chartex" xmlns:cx6="http://schemas.microsoft.com/office/drawing/2016/5/12/chartex" xmlns:cx7="http://schemas.microsoft.com/office/drawing/2016/5/13/chartex" xmlns:cx8="http://schemas.microsoft.com/office/drawing/2016/5/14/chartex" xmlns:mc="http://schemas.openxmlformats.org/markup-compatibility/2006" xmlns:aink="http://schemas.microsoft.com/office/drawing/2016/ink" xmlns:am3d="http://schemas.microsoft.com/office/drawing/2017/model3d" xmlns:o="urn:schemas-microsoft-com:office:office" xmlns:oel="http://schemas.microsoft.com/office/2019/extlst" xmlns:r="http://schemas.openxmlformats.org/officeDocument/2006/relationships" xmlns:m="http://schemas.openxmlformats.org/officeDocument/2006/math" xmlns:v="urn:schemas-microsoft-com:vml" xmlns:wp14="http://schemas.microsoft.com/office/word/2010/wordprocessingDrawing" xmlns:wp="http://schemas.openxmlformats.org/drawingml/2006/wordprocessingDrawing" xmlns:w10="urn:schemas-microsoft-com:office:word" xmlns:w="http://schemas.openxmlformats.org/wordprocessingml/2006/main" xmlns:w14="http://schemas.microsoft.com/office/word/2010/wordml" xmlns:w15="http://schemas.microsoft.com/office/word/2012/wordml" xmlns:w16cex="http://schemas.microsoft.com/office/word/2018/wordml/cex" xmlns:w16cid="http://schemas.microsoft.com/office/word/2016/wordml/cid" xmlns:w16="http://schemas.microsoft.com/office/word/2018/wordml" xmlns:w16du="http://schemas.microsoft.com/office/word/2023/wordml/word16du" xmlns:w16sdtdh="http://schemas.microsoft.com/office/word/2020/wordml/sdtdatahash" xmlns:w16sdtfl="http://schemas.microsoft.com/office/word/2024/wordml/sdtformatlock" xmlns:w16se="http://schemas.microsoft.com/office/word/2015/wordml/symex" xmlns:wpg="http://schemas.microsoft.com/office/word/2010/wordprocessingGroup" xmlns:wpi="http://schemas.microsoft.com/office/word/2010/wordprocessingInk" xmlns:wne="http://schemas.microsoft.com/office/word/2006/wordml" xmlns:wps="http://schemas.microsoft.com/office/word/2010/wordprocessingShape" mc:Ignorable="w14 w15 w16se w16cid w16 w16cex w16sdtdh w16sdtfl w16du wp14">
+  <w:p>
+    <w:pPr>
+      <w:pStyle w:val="Header"/>
+    </w:pPr>
+  </w:p>
+</w:hdr>
 </file>
 
 <file path=word/numbering.xml><?xml version="1.0" encoding="utf-8"?>
@@ -1343,6 +1559,50 @@
       <w:spacing w:val="5"/>
     </w:rPr>
   </w:style>
+  <w:style w:type="paragraph" w:styleId="Header">
+    <w:name w:val="header"/>
+    <w:basedOn w:val="Normal"/>
+    <w:link w:val="HeaderChar"/>
+    <w:uiPriority w:val="99"/>
+    <w:unhideWhenUsed/>
+    <w:rsid w:val="00653919"/>
+    <w:pPr>
+      <w:tabs>
+        <w:tab w:val="center" w:pos="4680"/>
+        <w:tab w:val="right" w:pos="9360"/>
+      </w:tabs>
+      <w:spacing w:after="0" w:line="240" w:lineRule="auto"/>
+    </w:pPr>
+  </w:style>
+  <w:style w:type="character" w:customStyle="1" w:styleId="HeaderChar">
+    <w:name w:val="Header Char"/>
+    <w:basedOn w:val="DefaultParagraphFont"/>
+    <w:link w:val="Header"/>
+    <w:uiPriority w:val="99"/>
+    <w:rsid w:val="00653919"/>
+  </w:style>
+  <w:style w:type="paragraph" w:styleId="Footer">
+    <w:name w:val="footer"/>
+    <w:basedOn w:val="Normal"/>
+    <w:link w:val="FooterChar"/>
+    <w:uiPriority w:val="99"/>
+    <w:unhideWhenUsed/>
+    <w:rsid w:val="00653919"/>
+    <w:pPr>
+      <w:tabs>
+        <w:tab w:val="center" w:pos="4680"/>
+        <w:tab w:val="right" w:pos="9360"/>
+      </w:tabs>
+      <w:spacing w:after="0" w:line="240" w:lineRule="auto"/>
+    </w:pPr>
+  </w:style>
+  <w:style w:type="character" w:customStyle="1" w:styleId="FooterChar">
+    <w:name w:val="Footer Char"/>
+    <w:basedOn w:val="DefaultParagraphFont"/>
+    <w:link w:val="Footer"/>
+    <w:uiPriority w:val="99"/>
+    <w:rsid w:val="00653919"/>
+  </w:style>
 </w:styles>
 </file>
 

</xml_diff>